<commit_message>
updating the cv document
</commit_message>
<xml_diff>
--- a/docs/Aidan_Wright_CV_2026.docx
+++ b/docs/Aidan_Wright_CV_2026.docx
@@ -4,276 +4,336 @@
   <w:body>
     <w:p>
       <w:pPr>
-        <w:pStyle w:val="Heading1"/>
+        <w:jc w:val="center"/>
       </w:pPr>
       <w:r>
+        <w:rPr>
+          <w:b/>
+          <w:sz w:val="36"/>
+        </w:rPr>
         <w:t>Aidan Wright</w:t>
       </w:r>
     </w:p>
     <w:p>
+      <w:pPr>
+        <w:spacing w:after="20"/>
+        <w:jc w:val="center"/>
+      </w:pPr>
       <w:r>
-        <w:t>Glasgow</w:t>
-      </w:r>
-      <w:r>
-        <w:t xml:space="preserve">, </w:t>
-      </w:r>
-      <w:r>
-        <w:t>Scotland</w:t>
-      </w:r>
-      <w:r>
-        <w:t xml:space="preserve"> | </w:t>
-      </w:r>
-      <w:r>
-        <w:t>aidan.wright@hotmail.co.uk</w:t>
-      </w:r>
-      <w:r>
-        <w:t xml:space="preserve"> | </w:t>
-      </w:r>
-      <w:r>
-        <w:t>+447861925147</w:t>
-      </w:r>
-      <w:r>
-        <w:t xml:space="preserve"> | </w:t>
-      </w:r>
-      <w:r>
-        <w:t>https://www.linkedin.com/in/aidan-wright-ab2ab1175/</w:t>
-      </w:r>
-      <w:r>
-        <w:br/>
+        <w:rPr>
+          <w:sz w:val="18"/>
+        </w:rPr>
+        <w:t>Glasgow, Scotland | aidan.wright@hotmail.co.uk | Full UK Driving Licence</w:t>
       </w:r>
     </w:p>
     <w:p>
       <w:pPr>
-        <w:pStyle w:val="Heading2"/>
+        <w:spacing w:after="100"/>
+        <w:jc w:val="center"/>
+      </w:pPr>
+      <w:hyperlink r:id="rId6" w:history="1">
+        <w:r>
+          <w:rPr>
+            <w:rStyle w:val="Hyperlink"/>
+            <w:sz w:val="18"/>
+          </w:rPr>
+          <w:t>LinkedIn</w:t>
+        </w:r>
+      </w:hyperlink>
+      <w:r>
+        <w:rPr>
+          <w:sz w:val="18"/>
+        </w:rPr>
+        <w:t xml:space="preserve">  |  </w:t>
+      </w:r>
+      <w:hyperlink r:id="rId7" w:anchor="home" w:history="1">
+        <w:r>
+          <w:rPr>
+            <w:rStyle w:val="Hyperlink"/>
+            <w:sz w:val="18"/>
+          </w:rPr>
+          <w:t>Portfolio</w:t>
+        </w:r>
+      </w:hyperlink>
+      <w:r>
+        <w:rPr>
+          <w:sz w:val="18"/>
+        </w:rPr>
+        <w:t xml:space="preserve">  |  </w:t>
+      </w:r>
+      <w:hyperlink r:id="rId8" w:history="1">
+        <w:r>
+          <w:rPr>
+            <w:rStyle w:val="Hyperlink"/>
+            <w:sz w:val="18"/>
+          </w:rPr>
+          <w:t>GitHub</w:t>
+        </w:r>
+      </w:hyperlink>
+    </w:p>
+    <w:p>
+      <w:pPr>
+        <w:pBdr>
+          <w:bottom w:val="single" w:sz="5" w:space="1" w:color="808080"/>
+        </w:pBdr>
+        <w:spacing w:before="80"/>
       </w:pPr>
       <w:r>
+        <w:rPr>
+          <w:b/>
+          <w:sz w:val="21"/>
+        </w:rPr>
         <w:t>PROFILE</w:t>
       </w:r>
     </w:p>
     <w:p>
       <w:r>
-        <w:t>Game Development graduate with First Class Honours and strong PC testing experience. Solid general PC knowledge, including Microsoft Office, Windows environments, and modern gaming hardware. Experienced in build verification, regression testing, and concise bug reporting. Focused, detail-oriented, and comfortable with repetitive testing under strict deadlines.</w:t>
+        <w:t>First Class Computer Games Development graduate with an HND in Web Development and practical experience across software development, web technologies, QA and technical problem solving. Experienced with C#, JavaScript, HTML/CSS, React, Unity, Git/GitHub and debugging, with recent QA support experience at Wee Tattie Studios. Reliable and comfortable working in fast-paced teams, communicating clearly and learning new systems. Seeking a Digital Support Apprenticeship to build hands-on experience supporting users, troubleshooting technical issues and developing a long-term career in IT and digital technology.</w:t>
       </w:r>
     </w:p>
     <w:p>
       <w:pPr>
-        <w:pStyle w:val="Heading2"/>
+        <w:pBdr>
+          <w:bottom w:val="single" w:sz="5" w:space="1" w:color="808080"/>
+        </w:pBdr>
+        <w:spacing w:before="80"/>
       </w:pPr>
       <w:r>
+        <w:rPr>
+          <w:b/>
+          <w:sz w:val="21"/>
+        </w:rPr>
+        <w:t>TECHNICAL &amp; DIGITAL SKILLS</w:t>
+      </w:r>
+    </w:p>
+    <w:p>
+      <w:r>
+        <w:t>Programming &amp; Web: C#, JavaScript, HTML5, CSS3, PHP, React, Vite, component-based UI development</w:t>
+      </w:r>
+    </w:p>
+    <w:p>
+      <w:r>
+        <w:t>Software &amp; Development: Unity, application logic, gameplay systems, debugging, browser-based applications</w:t>
+      </w:r>
+    </w:p>
+    <w:p>
+      <w:r>
+        <w:t>Tools: Git, GitHub, Visual Studio, Visual Studio Code, Babylon.js</w:t>
+      </w:r>
+    </w:p>
+    <w:p>
+      <w:r>
+        <w:t>3D &amp; Creative Tools: 3DS Max, Maya, Mudbox</w:t>
+      </w:r>
+    </w:p>
+    <w:p>
+      <w:r>
+        <w:t>Support Skills: Technical troubleshooting, structured testing, issue reporting, attention to detail, problem solving</w:t>
+      </w:r>
+    </w:p>
+    <w:p>
+      <w:r>
+        <w:t>Professional: Team collaboration, communication, organisation, reliability, adaptability and fast learning</w:t>
+      </w:r>
+    </w:p>
+    <w:p>
+      <w:pPr>
+        <w:pBdr>
+          <w:bottom w:val="single" w:sz="5" w:space="1" w:color="808080"/>
+        </w:pBdr>
+        <w:spacing w:before="80"/>
+      </w:pPr>
+      <w:r>
+        <w:rPr>
+          <w:b/>
+          <w:sz w:val="21"/>
+        </w:rPr>
+        <w:t>RELEVANT EXPERIENCE</w:t>
+      </w:r>
+    </w:p>
+    <w:p>
+      <w:r>
+        <w:t>QA Support — Wee Tattie Studios | 2026–Present</w:t>
+      </w:r>
+    </w:p>
+    <w:p>
+      <w:pPr>
+        <w:pStyle w:val="ListBullet"/>
+        <w:spacing w:after="20"/>
+        <w:ind w:left="259" w:hanging="173"/>
+      </w:pPr>
+      <w:r>
+        <w:t>Completed onboarding to support QA and playtesting within a collaborative game-development environment.</w:t>
+      </w:r>
+    </w:p>
+    <w:p>
+      <w:pPr>
+        <w:pStyle w:val="ListBullet"/>
+        <w:spacing w:after="20"/>
+        <w:ind w:left="259" w:hanging="173"/>
+      </w:pPr>
+      <w:r>
+        <w:t>Preparing to contribute structured testing, clear issue reporting and feedback to help identify and communicate software problems.</w:t>
+      </w:r>
+    </w:p>
+    <w:p>
+      <w:pPr>
+        <w:pBdr>
+          <w:bottom w:val="single" w:sz="5" w:space="1" w:color="808080"/>
+        </w:pBdr>
+        <w:spacing w:before="80"/>
+      </w:pPr>
+      <w:r>
+        <w:rPr>
+          <w:b/>
+          <w:sz w:val="21"/>
+        </w:rPr>
+        <w:t>SELECTED TECHNICAL PROJECTS</w:t>
+      </w:r>
+    </w:p>
+    <w:p>
+      <w:r>
+        <w:t>RingMaster Booker — Wrestling Booking Simulator | React • JavaScript • Vite</w:t>
+      </w:r>
+    </w:p>
+    <w:p>
+      <w:pPr>
+        <w:pStyle w:val="ListBullet"/>
+        <w:spacing w:after="20"/>
+        <w:ind w:left="259" w:hanging="173"/>
+      </w:pPr>
+      <w:r>
+        <w:t>Built a browser-based application with roster management, match booking, budgets, attendance, revenue and persistent save/load functionality.</w:t>
+      </w:r>
+    </w:p>
+    <w:p>
+      <w:pPr>
+        <w:pStyle w:val="ListBullet"/>
+        <w:spacing w:after="20"/>
+        <w:ind w:left="259" w:hanging="173"/>
+      </w:pPr>
+      <w:r>
+        <w:t>Used reusable React components and application state, developing practical experience in debugging and maintaining an interactive application.</w:t>
+      </w:r>
+    </w:p>
+    <w:p>
+      <w:r>
+        <w:t>Turn-Based Tactical Strategy Game | Unity • C#</w:t>
+      </w:r>
+    </w:p>
+    <w:p>
+      <w:pPr>
+        <w:pStyle w:val="ListBullet"/>
+        <w:spacing w:after="20"/>
+        <w:ind w:left="259" w:hanging="173"/>
+      </w:pPr>
+      <w:r>
+        <w:t>Developing grid movement, turn management, combat actions and AI behaviour for an XCOM-inspired project.</w:t>
+      </w:r>
+    </w:p>
+    <w:p>
+      <w:pPr>
+        <w:pStyle w:val="ListBullet"/>
+        <w:spacing w:after="20"/>
+        <w:ind w:left="259" w:hanging="173"/>
+      </w:pPr>
+      <w:r>
+        <w:t>Strengthening object-oriented programming, debugging and systematic problem-solving through iterative development.</w:t>
+      </w:r>
+    </w:p>
+    <w:p>
+      <w:r>
+        <w:t>Survival Horror Game — Honours Project | Unity • C#</w:t>
+      </w:r>
+    </w:p>
+    <w:p>
+      <w:pPr>
+        <w:pStyle w:val="ListBullet"/>
+        <w:spacing w:after="20"/>
+        <w:ind w:left="259" w:hanging="173"/>
+      </w:pPr>
+      <w:r>
+        <w:t>Designed and developed gameplay systems, enemy behaviours, cinematic camera work and interactive environments as a substantial final-year project.</w:t>
+      </w:r>
+    </w:p>
+    <w:p>
+      <w:pPr>
+        <w:pBdr>
+          <w:bottom w:val="single" w:sz="5" w:space="1" w:color="808080"/>
+        </w:pBdr>
+        <w:spacing w:before="80"/>
+      </w:pPr>
+      <w:r>
+        <w:rPr>
+          <w:b/>
+          <w:sz w:val="21"/>
+        </w:rPr>
         <w:t>EDUCATION</w:t>
       </w:r>
     </w:p>
     <w:p>
       <w:r>
-        <w:t>BSc (Hons) Game Development — First Class Honours</w:t>
+        <w:t>BSc (Hons) Computer Games Development — First Class Honours | University of the West of Scotland, 2023–2025</w:t>
       </w:r>
+    </w:p>
+    <w:p>
       <w:r>
-        <w:br/>
+        <w:t>HNC Games Development &amp; Animation | City of Glasgow College, 2022–2023</w:t>
       </w:r>
+    </w:p>
+    <w:p>
       <w:r>
-        <w:t>UWS, Paisley</w:t>
-      </w:r>
-      <w:r>
-        <w:t xml:space="preserve"> </w:t>
-      </w:r>
-      <w:r>
-        <w:t>2025</w:t>
+        <w:t>HND Web Development | City of Glasgow College, 2016–2018</w:t>
       </w:r>
     </w:p>
     <w:p>
       <w:pPr>
-        <w:pStyle w:val="Heading2"/>
+        <w:pBdr>
+          <w:bottom w:val="single" w:sz="5" w:space="1" w:color="808080"/>
+        </w:pBdr>
+        <w:spacing w:before="80"/>
       </w:pPr>
       <w:r>
-        <w:t>QA &amp; TECHNICAL SKILLS</w:t>
+        <w:rPr>
+          <w:b/>
+          <w:sz w:val="21"/>
+        </w:rPr>
+        <w:t>EMPLOYMENT</w:t>
+      </w:r>
+    </w:p>
+    <w:p>
+      <w:r>
+        <w:t>Kitchen Porter — Coachman Hotel | 2017–Present</w:t>
       </w:r>
     </w:p>
     <w:p>
       <w:pPr>
         <w:pStyle w:val="ListBullet"/>
+        <w:spacing w:after="20"/>
+        <w:ind w:left="259" w:hanging="173"/>
       </w:pPr>
       <w:r>
-        <w:t>Build verification, smoke &amp; regression testing</w:t>
+        <w:t>Long-term record of reliability in a fast-paced team environment, adapting to changing priorities during busy service periods.</w:t>
       </w:r>
     </w:p>
     <w:p>
       <w:pPr>
         <w:pStyle w:val="ListBullet"/>
+        <w:spacing w:after="20"/>
+        <w:ind w:left="259" w:hanging="173"/>
       </w:pPr>
       <w:r>
-        <w:t>Bug identification, reproduction, and written reporting</w:t>
-      </w:r>
-    </w:p>
-    <w:p>
-      <w:pPr>
-        <w:pStyle w:val="ListBullet"/>
-      </w:pPr>
-      <w:r>
-        <w:t>Stability, performance, and crash testing</w:t>
-      </w:r>
-    </w:p>
-    <w:p>
-      <w:pPr>
-        <w:pStyle w:val="ListBullet"/>
-      </w:pPr>
-      <w:r>
-        <w:t>Windows OS &amp; Microsoft Office (Word, Excel, Outlook)</w:t>
-      </w:r>
-    </w:p>
-    <w:p>
-      <w:pPr>
-        <w:pStyle w:val="ListBullet"/>
-      </w:pPr>
-      <w:r>
-        <w:t>PC hardware awareness; knowledge of current-gen consoles</w:t>
-      </w:r>
-    </w:p>
-    <w:p>
-      <w:pPr>
-        <w:pStyle w:val="ListBullet"/>
-      </w:pPr>
-      <w:r>
-        <w:t>Unity</w:t>
-      </w:r>
-    </w:p>
-    <w:p>
-      <w:pPr>
-        <w:pStyle w:val="ListBullet"/>
-      </w:pPr>
-      <w:r>
-        <w:t>Git / version control</w:t>
-      </w:r>
-    </w:p>
-    <w:p>
-      <w:pPr>
-        <w:pStyle w:val="Heading2"/>
-      </w:pPr>
-      <w:r>
-        <w:t>PROJECT EXPERIENCE</w:t>
+        <w:t>Maintain high standards of organisation, communication and attendance while supporting efficient day-to-day operations.</w:t>
       </w:r>
     </w:p>
     <w:p>
       <w:r>
-        <w:t>Final Year Project — Solo Development</w:t>
-      </w:r>
-      <w:r>
-        <w:br/>
-        <w:t>PC Survival Horror Game (Classic Resident Evil–inspired)</w:t>
-      </w:r>
-    </w:p>
-    <w:p>
-      <w:pPr>
-        <w:pStyle w:val="ListBullet"/>
-      </w:pPr>
-      <w:r>
-        <w:t>Verified PC builds prior to milestones for stability and functionality</w:t>
-      </w:r>
-    </w:p>
-    <w:p>
-      <w:pPr>
-        <w:pStyle w:val="ListBullet"/>
-      </w:pPr>
-      <w:r>
-        <w:t>Identified, reproduced, and documented bugs with clear repro steps</w:t>
-      </w:r>
-    </w:p>
-    <w:p>
-      <w:pPr>
-        <w:pStyle w:val="ListBullet"/>
-      </w:pPr>
-      <w:r>
-        <w:t>Performed regression testing to confirm fixes and prevent reoccurrence</w:t>
-      </w:r>
-    </w:p>
-    <w:p>
-      <w:pPr>
-        <w:pStyle w:val="ListBullet"/>
-      </w:pPr>
-      <w:r>
-        <w:t>Maintained focus during repetitive testing passes across multiple builds</w:t>
-      </w:r>
-    </w:p>
-    <w:p>
-      <w:pPr>
-        <w:pStyle w:val="ListBullet"/>
-      </w:pPr>
-      <w:r>
-        <w:t>Balanced testing, development, and documentation within strict deadlines</w:t>
-      </w:r>
-    </w:p>
-    <w:p>
-      <w:pPr>
-        <w:pStyle w:val="ListBullet"/>
-      </w:pPr>
-      <w:r>
-        <w:t>Communicated complex technical issues concisely through written reports</w:t>
-      </w:r>
-    </w:p>
-    <w:p>
-      <w:pPr>
-        <w:pStyle w:val="ListBullet"/>
-      </w:pPr>
-      <w:r>
-        <w:t>Used version control to track changes and isolate defects</w:t>
-      </w:r>
-    </w:p>
-    <w:p>
-      <w:pPr>
-        <w:pStyle w:val="Heading2"/>
-      </w:pPr>
-      <w:r>
-        <w:t>KEY STRENGTHS</w:t>
-      </w:r>
-    </w:p>
-    <w:p>
-      <w:pPr>
-        <w:pStyle w:val="ListBullet"/>
-      </w:pPr>
-      <w:r>
-        <w:t>Excellent attention to detail</w:t>
-      </w:r>
-    </w:p>
-    <w:p>
-      <w:pPr>
-        <w:pStyle w:val="ListBullet"/>
-      </w:pPr>
-      <w:r>
-        <w:t>Clear written and verbal communication</w:t>
-      </w:r>
-    </w:p>
-    <w:p>
-      <w:pPr>
-        <w:pStyle w:val="ListBullet"/>
-      </w:pPr>
-      <w:r>
-        <w:t>Strong prioritisation and time management</w:t>
-      </w:r>
-    </w:p>
-    <w:p>
-      <w:pPr>
-        <w:pStyle w:val="ListBullet"/>
-      </w:pPr>
-      <w:r>
-        <w:lastRenderedPageBreak/>
-        <w:t>Reliable, focused approach to repetitive tasks</w:t>
-      </w:r>
-    </w:p>
-    <w:p>
-      <w:pPr>
-        <w:pStyle w:val="Heading2"/>
-      </w:pPr>
-      <w:r>
-        <w:t>GAMING KNOWLEDGE</w:t>
-      </w:r>
-    </w:p>
-    <w:p>
-      <w:r>
-        <w:t>Strong understanding of Rockstar Games titles, including singleplayer and multiplayer systems.</w:t>
+        <w:t>Floor Staff — Home Bargains | 2016</w:t>
       </w:r>
     </w:p>
     <w:sectPr>
       <w:pgSz w:w="12240" w:h="15840"/>
-      <w:pgMar w:top="1440" w:right="1800" w:bottom="1440" w:left="1800" w:header="720" w:footer="720" w:gutter="0"/>
+      <w:pgMar w:top="691" w:right="893" w:bottom="691" w:left="893" w:header="720" w:footer="720" w:gutter="0"/>
       <w:cols w:space="720"/>
       <w:docGrid w:linePitch="360"/>
     </w:sectPr>
@@ -454,31 +514,31 @@
       </w:rPr>
     </w:lvl>
   </w:abstractNum>
-  <w:num w:numId="1" w16cid:durableId="1629362230">
+  <w:num w:numId="1" w16cid:durableId="1433235225">
     <w:abstractNumId w:val="8"/>
   </w:num>
-  <w:num w:numId="2" w16cid:durableId="939529670">
+  <w:num w:numId="2" w16cid:durableId="533929704">
     <w:abstractNumId w:val="6"/>
   </w:num>
-  <w:num w:numId="3" w16cid:durableId="1480879501">
+  <w:num w:numId="3" w16cid:durableId="409085729">
     <w:abstractNumId w:val="5"/>
   </w:num>
-  <w:num w:numId="4" w16cid:durableId="693070451">
+  <w:num w:numId="4" w16cid:durableId="983849275">
     <w:abstractNumId w:val="4"/>
   </w:num>
-  <w:num w:numId="5" w16cid:durableId="1325426166">
+  <w:num w:numId="5" w16cid:durableId="1642922284">
     <w:abstractNumId w:val="7"/>
   </w:num>
-  <w:num w:numId="6" w16cid:durableId="2060277157">
+  <w:num w:numId="6" w16cid:durableId="787431513">
     <w:abstractNumId w:val="3"/>
   </w:num>
-  <w:num w:numId="7" w16cid:durableId="1115640208">
+  <w:num w:numId="7" w16cid:durableId="1112170903">
     <w:abstractNumId w:val="2"/>
   </w:num>
-  <w:num w:numId="8" w16cid:durableId="394011809">
+  <w:num w:numId="8" w16cid:durableId="2126191055">
     <w:abstractNumId w:val="1"/>
   </w:num>
-  <w:num w:numId="9" w16cid:durableId="1647780410">
+  <w:num w:numId="9" w16cid:durableId="1824083361">
     <w:abstractNumId w:val="0"/>
   </w:num>
 </w:numbering>
@@ -874,6 +934,13 @@
     <w:name w:val="Normal"/>
     <w:qFormat/>
     <w:rsid w:val="00FC693F"/>
+    <w:pPr>
+      <w:spacing w:after="40"/>
+    </w:pPr>
+    <w:rPr>
+      <w:rFonts w:ascii="Arial" w:hAnsi="Arial"/>
+      <w:sz w:val="19"/>
+    </w:rPr>
   </w:style>
   <w:style w:type="paragraph" w:styleId="Heading1">
     <w:name w:val="heading 1"/>
@@ -11863,6 +11930,29 @@
         <w:shd w:val="clear" w:color="auto" w:fill="FBCAA2" w:themeFill="accent6" w:themeFillTint="7F"/>
       </w:tcPr>
     </w:tblStylePr>
+  </w:style>
+  <w:style w:type="character" w:styleId="Hyperlink">
+    <w:name w:val="Hyperlink"/>
+    <w:basedOn w:val="DefaultParagraphFont"/>
+    <w:uiPriority w:val="99"/>
+    <w:unhideWhenUsed/>
+    <w:rsid w:val="00FF00B4"/>
+    <w:rPr>
+      <w:color w:val="0000FF" w:themeColor="hyperlink"/>
+      <w:u w:val="single"/>
+    </w:rPr>
+  </w:style>
+  <w:style w:type="character" w:styleId="UnresolvedMention">
+    <w:name w:val="Unresolved Mention"/>
+    <w:basedOn w:val="DefaultParagraphFont"/>
+    <w:uiPriority w:val="99"/>
+    <w:semiHidden/>
+    <w:unhideWhenUsed/>
+    <w:rsid w:val="00FF00B4"/>
+    <w:rPr>
+      <w:color w:val="605E5C"/>
+      <w:shd w:val="clear" w:color="auto" w:fill="E1DFDD"/>
+    </w:rPr>
   </w:style>
 </w:styles>
 </file>

</xml_diff>